<commit_message>
Added Exp.Selected on Debtors Debtors - Backorders tab Exp.Selected – Partial translated label This translation seems broken in all languages. Unit 1131 / 1775 Exp. Geselekteerde (Exp. Selected) (Exp.+TranslationID 1170 A combination will not work in some languages as the word sequence may change in translations.
</commit_message>
<xml_diff>
--- a/known-issues-language-translations/Language-label-inconsistencies.docx
+++ b/known-issues-language-translations/Language-label-inconsistencies.docx
@@ -58,7 +58,7 @@
           <w:r>
             <w:fldChar w:fldCharType="separate"/>
           </w:r>
-          <w:hyperlink w:anchor="_Toc214945294" w:history="1">
+          <w:hyperlink w:anchor="_Toc227051240" w:history="1">
             <w:r>
               <w:rPr>
                 <w:rStyle w:val="Hyperlink"/>
@@ -86,7 +86,7 @@
                 <w:noProof/>
                 <w:webHidden/>
               </w:rPr>
-              <w:instrText xml:space="preserve"> PAGEREF _Toc214945294 \h </w:instrText>
+              <w:instrText xml:space="preserve"> PAGEREF _Toc227051240 \h </w:instrText>
             </w:r>
             <w:r>
               <w:rPr>
@@ -133,13 +133,13 @@
               <w14:ligatures w14:val="standardContextual"/>
             </w:rPr>
           </w:pPr>
-          <w:hyperlink w:anchor="_Toc214945295" w:history="1">
+          <w:hyperlink w:anchor="_Toc227051241" w:history="1">
             <w:r>
               <w:rPr>
                 <w:rStyle w:val="Hyperlink"/>
                 <w:noProof/>
               </w:rPr>
-              <w:t>Receipt / Receipts</w:t>
+              <w:t>Debtors - Backorders tab Exp.Selected – Partial translated label</w:t>
             </w:r>
             <w:r>
               <w:rPr>
@@ -160,7 +160,7 @@
                 <w:noProof/>
                 <w:webHidden/>
               </w:rPr>
-              <w:instrText xml:space="preserve"> PAGEREF _Toc214945295 \h </w:instrText>
+              <w:instrText xml:space="preserve"> PAGEREF _Toc227051241 \h </w:instrText>
             </w:r>
             <w:r>
               <w:rPr>
@@ -207,7 +207,81 @@
               <w14:ligatures w14:val="standardContextual"/>
             </w:rPr>
           </w:pPr>
-          <w:hyperlink w:anchor="_Toc214945296" w:history="1">
+          <w:hyperlink w:anchor="_Toc227051242" w:history="1">
+            <w:r>
+              <w:rPr>
+                <w:rStyle w:val="Hyperlink"/>
+                <w:noProof/>
+              </w:rPr>
+              <w:t>Receipt / Receipts</w:t>
+            </w:r>
+            <w:r>
+              <w:rPr>
+                <w:noProof/>
+                <w:webHidden/>
+              </w:rPr>
+              <w:tab/>
+            </w:r>
+            <w:r>
+              <w:rPr>
+                <w:noProof/>
+                <w:webHidden/>
+              </w:rPr>
+              <w:fldChar w:fldCharType="begin"/>
+            </w:r>
+            <w:r>
+              <w:rPr>
+                <w:noProof/>
+                <w:webHidden/>
+              </w:rPr>
+              <w:instrText xml:space="preserve"> PAGEREF _Toc227051242 \h </w:instrText>
+            </w:r>
+            <w:r>
+              <w:rPr>
+                <w:noProof/>
+                <w:webHidden/>
+              </w:rPr>
+            </w:r>
+            <w:r>
+              <w:rPr>
+                <w:noProof/>
+                <w:webHidden/>
+              </w:rPr>
+              <w:fldChar w:fldCharType="separate"/>
+            </w:r>
+            <w:r>
+              <w:rPr>
+                <w:noProof/>
+                <w:webHidden/>
+              </w:rPr>
+              <w:t>1</w:t>
+            </w:r>
+            <w:r>
+              <w:rPr>
+                <w:noProof/>
+                <w:webHidden/>
+              </w:rPr>
+              <w:fldChar w:fldCharType="end"/>
+            </w:r>
+          </w:hyperlink>
+        </w:p>
+        <w:p>
+          <w:pPr>
+            <w:pStyle w:val="TOC2"/>
+            <w:tabs>
+              <w:tab w:val="right" w:leader="dot" w:pos="10456"/>
+            </w:tabs>
+            <w:rPr>
+              <w:rFonts w:eastAsiaTheme="minorEastAsia"/>
+              <w:noProof/>
+              <w:kern w:val="2"/>
+              <w:sz w:val="24"/>
+              <w:szCs w:val="24"/>
+              <w:lang w:eastAsia="en-ZA"/>
+              <w14:ligatures w14:val="standardContextual"/>
+            </w:rPr>
+          </w:pPr>
+          <w:hyperlink w:anchor="_Toc227051243" w:history="1">
             <w:r>
               <w:rPr>
                 <w:rStyle w:val="Hyperlink"/>
@@ -234,7 +308,7 @@
                 <w:noProof/>
                 <w:webHidden/>
               </w:rPr>
-              <w:instrText xml:space="preserve"> PAGEREF _Toc214945296 \h </w:instrText>
+              <w:instrText xml:space="preserve"> PAGEREF _Toc227051243 \h </w:instrText>
             </w:r>
             <w:r>
               <w:rPr>
@@ -281,7 +355,7 @@
               <w14:ligatures w14:val="standardContextual"/>
             </w:rPr>
           </w:pPr>
-          <w:hyperlink w:anchor="_Toc214945297" w:history="1">
+          <w:hyperlink w:anchor="_Toc227051244" w:history="1">
             <w:r>
               <w:rPr>
                 <w:rStyle w:val="Hyperlink"/>
@@ -308,7 +382,7 @@
                 <w:noProof/>
                 <w:webHidden/>
               </w:rPr>
-              <w:instrText xml:space="preserve"> PAGEREF _Toc214945297 \h </w:instrText>
+              <w:instrText xml:space="preserve"> PAGEREF _Toc227051244 \h </w:instrText>
             </w:r>
             <w:r>
               <w:rPr>
@@ -358,7 +432,7 @@
           <w:lang w:eastAsia="en-ZA"/>
         </w:rPr>
       </w:pPr>
-      <w:bookmarkStart w:id="0" w:name="_Toc214945294"/>
+      <w:bookmarkStart w:id="0" w:name="_Toc227051240"/>
       <w:r>
         <w:rPr>
           <w:lang w:eastAsia="en-ZA"/>
@@ -370,17 +444,261 @@
     <w:p>
       <w:pPr>
         <w:pStyle w:val="Heading2"/>
+      </w:pPr>
+      <w:bookmarkStart w:id="1" w:name="_Toc167252164"/>
+      <w:bookmarkStart w:id="2" w:name="_Toc227051241"/>
+      <w:r>
+        <w:t>Debtors - Backorders tab</w:t>
+      </w:r>
+      <w:bookmarkEnd w:id="1"/>
+      <w:r>
+        <w:t xml:space="preserve"> </w:t>
+      </w:r>
+      <w:proofErr w:type="spellStart"/>
+      <w:r>
+        <w:t>Exp.Selected</w:t>
+      </w:r>
+      <w:proofErr w:type="spellEnd"/>
+      <w:r>
+        <w:t xml:space="preserve"> – Partial translated label</w:t>
+      </w:r>
+      <w:bookmarkEnd w:id="2"/>
+      <w:r>
+        <w:t xml:space="preserve"> </w:t>
+      </w:r>
+    </w:p>
+    <w:p>
+      <w:r>
+        <w:t>This translation seems broken in all languages.</w:t>
+      </w:r>
+    </w:p>
+    <w:p>
+      <w:pPr>
+        <w:autoSpaceDE w:val="0"/>
+        <w:autoSpaceDN w:val="0"/>
+        <w:adjustRightInd w:val="0"/>
+        <w:spacing w:before="75" w:after="75" w:line="360" w:lineRule="auto"/>
+        <w:rPr>
+          <w:rFonts w:ascii="Segoe UI Black" w:hAnsi="Segoe UI Black" w:cs="Segoe UI Black"/>
+          <w:b/>
+          <w:bCs/>
+          <w:i/>
+          <w:iCs/>
+          <w:color w:val="333399"/>
+          <w:lang w:val="x-none"/>
+        </w:rPr>
+      </w:pPr>
+      <w:r>
+        <w:rPr>
+          <w:rFonts w:ascii="Segoe UI Black" w:hAnsi="Segoe UI Black" w:cs="Segoe UI Black"/>
+          <w:b/>
+          <w:bCs/>
+          <w:i/>
+          <w:iCs/>
+          <w:noProof/>
+          <w:color w:val="333399"/>
+          <w:lang w:val="x-none"/>
+        </w:rPr>
+        <w:drawing>
+          <wp:inline distT="0" distB="0" distL="0" distR="0" wp14:anchorId="2CEEBDD7" wp14:editId="5DF5A13E">
+            <wp:extent cx="6645910" cy="1229360"/>
+            <wp:effectExtent l="0" t="0" r="2540" b="8890"/>
+            <wp:docPr id="138904628" name="Picture 1"/>
+            <wp:cNvGraphicFramePr>
+              <a:graphicFrameLocks xmlns:a="http://schemas.openxmlformats.org/drawingml/2006/main" noChangeAspect="1"/>
+            </wp:cNvGraphicFramePr>
+            <a:graphic xmlns:a="http://schemas.openxmlformats.org/drawingml/2006/main">
+              <a:graphicData uri="http://schemas.openxmlformats.org/drawingml/2006/picture">
+                <pic:pic xmlns:pic="http://schemas.openxmlformats.org/drawingml/2006/picture">
+                  <pic:nvPicPr>
+                    <pic:cNvPr id="0" name="Picture 13"/>
+                    <pic:cNvPicPr>
+                      <a:picLocks noChangeAspect="1" noChangeArrowheads="1"/>
+                    </pic:cNvPicPr>
+                  </pic:nvPicPr>
+                  <pic:blipFill>
+                    <a:blip r:embed="rId6">
+                      <a:extLst>
+                        <a:ext uri="{28A0092B-C50C-407E-A947-70E740481C1C}">
+                          <a14:useLocalDpi xmlns:a14="http://schemas.microsoft.com/office/drawing/2010/main" val="0"/>
+                        </a:ext>
+                      </a:extLst>
+                    </a:blip>
+                    <a:srcRect/>
+                    <a:stretch>
+                      <a:fillRect/>
+                    </a:stretch>
+                  </pic:blipFill>
+                  <pic:spPr bwMode="auto">
+                    <a:xfrm>
+                      <a:off x="0" y="0"/>
+                      <a:ext cx="6645910" cy="1229360"/>
+                    </a:xfrm>
+                    <a:prstGeom prst="rect">
+                      <a:avLst/>
+                    </a:prstGeom>
+                    <a:noFill/>
+                    <a:ln>
+                      <a:noFill/>
+                    </a:ln>
+                  </pic:spPr>
+                </pic:pic>
+              </a:graphicData>
+            </a:graphic>
+          </wp:inline>
+        </w:drawing>
+      </w:r>
+    </w:p>
+    <w:p>
+      <w:pPr>
+        <w:autoSpaceDE w:val="0"/>
+        <w:autoSpaceDN w:val="0"/>
+        <w:adjustRightInd w:val="0"/>
+        <w:spacing w:before="75" w:after="75" w:line="360" w:lineRule="auto"/>
+        <w:rPr>
+          <w:rFonts w:ascii="Segoe UI" w:hAnsi="Segoe UI" w:cs="Segoe UI"/>
+          <w:sz w:val="20"/>
+          <w:szCs w:val="20"/>
+          <w:lang w:val="x-none"/>
+        </w:rPr>
+      </w:pPr>
+      <w:r>
+        <w:rPr>
+          <w:rFonts w:ascii="Segoe UI" w:hAnsi="Segoe UI" w:cs="Segoe UI"/>
+          <w:sz w:val="20"/>
+          <w:szCs w:val="20"/>
+          <w:lang w:val="x-none"/>
+        </w:rPr>
+        <w:t>Unit 1131 / 1775</w:t>
+      </w:r>
+    </w:p>
+    <w:p>
+      <w:pPr>
+        <w:autoSpaceDE w:val="0"/>
+        <w:autoSpaceDN w:val="0"/>
+        <w:adjustRightInd w:val="0"/>
+        <w:spacing w:before="75" w:after="75" w:line="360" w:lineRule="auto"/>
+        <w:rPr>
+          <w:rFonts w:ascii="Segoe UI" w:hAnsi="Segoe UI" w:cs="Segoe UI"/>
+          <w:sz w:val="20"/>
+          <w:szCs w:val="20"/>
+          <w:lang w:val="x-none"/>
+        </w:rPr>
+      </w:pPr>
+      <w:r>
+        <w:rPr>
+          <w:rFonts w:ascii="Segoe UI" w:hAnsi="Segoe UI" w:cs="Segoe UI"/>
+          <w:sz w:val="20"/>
+          <w:szCs w:val="20"/>
+          <w:lang w:val="x-none"/>
+        </w:rPr>
+        <w:t xml:space="preserve">Exp. </w:t>
+      </w:r>
+      <w:proofErr w:type="spellStart"/>
+      <w:r>
+        <w:rPr>
+          <w:rFonts w:ascii="Segoe UI" w:hAnsi="Segoe UI" w:cs="Segoe UI"/>
+          <w:sz w:val="20"/>
+          <w:szCs w:val="20"/>
+          <w:lang w:val="x-none"/>
+        </w:rPr>
+        <w:t>Geselekteerde</w:t>
+      </w:r>
+      <w:proofErr w:type="spellEnd"/>
+      <w:r>
+        <w:rPr>
+          <w:rFonts w:ascii="Segoe UI" w:hAnsi="Segoe UI" w:cs="Segoe UI"/>
+          <w:sz w:val="20"/>
+          <w:szCs w:val="20"/>
+          <w:lang w:val="x-none"/>
+        </w:rPr>
+        <w:t xml:space="preserve"> (Exp. Selected)</w:t>
+      </w:r>
+      <w:r>
+        <w:rPr>
+          <w:rFonts w:ascii="Segoe UI" w:hAnsi="Segoe UI" w:cs="Segoe UI"/>
+          <w:sz w:val="20"/>
+          <w:szCs w:val="20"/>
+          <w:lang w:val="x-none"/>
+        </w:rPr>
+        <w:t xml:space="preserve"> (Exp.+</w:t>
+      </w:r>
+      <w:proofErr w:type="spellStart"/>
+      <w:r>
+        <w:rPr>
+          <w:rFonts w:ascii="Segoe UI" w:hAnsi="Segoe UI" w:cs="Segoe UI"/>
+          <w:sz w:val="20"/>
+          <w:szCs w:val="20"/>
+          <w:lang w:val="x-none"/>
+        </w:rPr>
+        <w:t>TranslationID</w:t>
+      </w:r>
+      <w:proofErr w:type="spellEnd"/>
+      <w:r>
+        <w:rPr>
+          <w:rFonts w:ascii="Segoe UI" w:hAnsi="Segoe UI" w:cs="Segoe UI"/>
+          <w:sz w:val="20"/>
+          <w:szCs w:val="20"/>
+          <w:lang w:val="x-none"/>
+        </w:rPr>
+        <w:t xml:space="preserve"> 1170</w:t>
+      </w:r>
+    </w:p>
+    <w:p>
+      <w:pPr>
+        <w:autoSpaceDE w:val="0"/>
+        <w:autoSpaceDN w:val="0"/>
+        <w:adjustRightInd w:val="0"/>
+        <w:spacing w:before="75" w:after="75" w:line="360" w:lineRule="auto"/>
+        <w:rPr>
+          <w:rFonts w:ascii="Segoe UI" w:hAnsi="Segoe UI" w:cs="Segoe UI"/>
+          <w:sz w:val="20"/>
+          <w:szCs w:val="20"/>
+          <w:lang w:val="x-none"/>
+        </w:rPr>
+      </w:pPr>
+      <w:r>
+        <w:rPr>
+          <w:rFonts w:ascii="Segoe UI" w:hAnsi="Segoe UI" w:cs="Segoe UI"/>
+          <w:sz w:val="20"/>
+          <w:szCs w:val="20"/>
+          <w:lang w:val="x-none"/>
+        </w:rPr>
+        <w:t xml:space="preserve">A combination </w:t>
+      </w:r>
+      <w:r>
+        <w:rPr>
+          <w:rFonts w:ascii="Segoe UI" w:hAnsi="Segoe UI" w:cs="Segoe UI"/>
+          <w:sz w:val="20"/>
+          <w:szCs w:val="20"/>
+          <w:lang w:val="x-none"/>
+        </w:rPr>
+        <w:t>w</w:t>
+      </w:r>
+      <w:r>
+        <w:rPr>
+          <w:rFonts w:ascii="Segoe UI" w:hAnsi="Segoe UI" w:cs="Segoe UI"/>
+          <w:sz w:val="20"/>
+          <w:szCs w:val="20"/>
+          <w:lang w:val="x-none"/>
+        </w:rPr>
+        <w:t xml:space="preserve">ill not work in some languages as the word sequence may change in translations. </w:t>
+      </w:r>
+    </w:p>
+    <w:p>
+      <w:pPr>
+        <w:pStyle w:val="Heading2"/>
         <w:rPr>
           <w:rFonts w:ascii="Segoe UI" w:hAnsi="Segoe UI" w:cs="Segoe UI"/>
           <w:sz w:val="20"/>
           <w:szCs w:val="20"/>
         </w:rPr>
       </w:pPr>
-      <w:bookmarkStart w:id="1" w:name="_Toc214945295"/>
+      <w:bookmarkStart w:id="3" w:name="_Toc227051242"/>
       <w:r>
         <w:t>Receipt / Receipts</w:t>
       </w:r>
-      <w:bookmarkEnd w:id="1"/>
+      <w:bookmarkEnd w:id="3"/>
       <w:r>
         <w:rPr>
           <w:rFonts w:ascii="Segoe UI" w:hAnsi="Segoe UI" w:cs="Segoe UI"/>
@@ -472,7 +790,7 @@
                     </pic:cNvPicPr>
                   </pic:nvPicPr>
                   <pic:blipFill>
-                    <a:blip r:embed="rId6">
+                    <a:blip r:embed="rId7">
                       <a:extLst>
                         <a:ext uri="{28A0092B-C50C-407E-A947-70E740481C1C}">
                           <a14:useLocalDpi xmlns:a14="http://schemas.microsoft.com/office/drawing/2010/main" val="0"/>
@@ -590,6 +908,7 @@
           <w:szCs w:val="20"/>
           <w:lang w:val="x-none"/>
         </w:rPr>
+        <w:lastRenderedPageBreak/>
         <w:t xml:space="preserve">This will resolve issues relating to other language dialects, such as Afrikaans, French, Spanish, etc. </w:t>
       </w:r>
     </w:p>
@@ -632,7 +951,7 @@
                     </pic:cNvPicPr>
                   </pic:nvPicPr>
                   <pic:blipFill>
-                    <a:blip r:embed="rId7">
+                    <a:blip r:embed="rId8">
                       <a:extLst>
                         <a:ext uri="{28A0092B-C50C-407E-A947-70E740481C1C}">
                           <a14:useLocalDpi xmlns:a14="http://schemas.microsoft.com/office/drawing/2010/main" val="0"/>
@@ -684,7 +1003,6 @@
           <w:szCs w:val="20"/>
           <w:lang w:val="x-none"/>
         </w:rPr>
-        <w:lastRenderedPageBreak/>
         <w:t>Receipts options (</w:t>
       </w:r>
       <w:proofErr w:type="spellStart"/>
@@ -747,7 +1065,7 @@
                     </pic:cNvPicPr>
                   </pic:nvPicPr>
                   <pic:blipFill>
-                    <a:blip r:embed="rId8">
+                    <a:blip r:embed="rId9">
                       <a:extLst>
                         <a:ext uri="{28A0092B-C50C-407E-A947-70E740481C1C}">
                           <a14:useLocalDpi xmlns:a14="http://schemas.microsoft.com/office/drawing/2010/main" val="0"/>
@@ -846,112 +1164,14 @@
     </w:p>
     <w:p>
       <w:pPr>
-        <w:autoSpaceDE w:val="0"/>
-        <w:autoSpaceDN w:val="0"/>
-        <w:adjustRightInd w:val="0"/>
-        <w:spacing w:before="75" w:after="75" w:line="360" w:lineRule="auto"/>
-        <w:rPr>
-          <w:rFonts w:ascii="Segoe UI" w:hAnsi="Segoe UI" w:cs="Segoe UI"/>
-          <w:sz w:val="20"/>
-          <w:szCs w:val="20"/>
-          <w:lang w:val="x-none"/>
-        </w:rPr>
-      </w:pPr>
-    </w:p>
-    <w:p>
-      <w:pPr>
-        <w:autoSpaceDE w:val="0"/>
-        <w:autoSpaceDN w:val="0"/>
-        <w:adjustRightInd w:val="0"/>
-        <w:spacing w:before="75" w:after="75" w:line="360" w:lineRule="auto"/>
-        <w:rPr>
-          <w:rFonts w:ascii="Segoe UI" w:hAnsi="Segoe UI" w:cs="Segoe UI"/>
-          <w:sz w:val="20"/>
-          <w:szCs w:val="20"/>
-          <w:lang w:val="x-none"/>
-        </w:rPr>
-      </w:pPr>
-    </w:p>
-    <w:p>
-      <w:pPr>
-        <w:autoSpaceDE w:val="0"/>
-        <w:autoSpaceDN w:val="0"/>
-        <w:adjustRightInd w:val="0"/>
-        <w:spacing w:before="75" w:after="75" w:line="360" w:lineRule="auto"/>
-        <w:rPr>
-          <w:rFonts w:ascii="Segoe UI" w:hAnsi="Segoe UI" w:cs="Segoe UI"/>
-          <w:sz w:val="20"/>
-          <w:szCs w:val="20"/>
-          <w:lang w:val="x-none"/>
-        </w:rPr>
-      </w:pPr>
-    </w:p>
-    <w:p>
-      <w:pPr>
-        <w:autoSpaceDE w:val="0"/>
-        <w:autoSpaceDN w:val="0"/>
-        <w:adjustRightInd w:val="0"/>
-        <w:spacing w:before="75" w:after="75" w:line="360" w:lineRule="auto"/>
-        <w:rPr>
-          <w:rFonts w:ascii="Segoe UI" w:hAnsi="Segoe UI" w:cs="Segoe UI"/>
-          <w:sz w:val="20"/>
-          <w:szCs w:val="20"/>
-          <w:lang w:val="x-none"/>
-        </w:rPr>
-      </w:pPr>
-    </w:p>
-    <w:p>
-      <w:pPr>
-        <w:autoSpaceDE w:val="0"/>
-        <w:autoSpaceDN w:val="0"/>
-        <w:adjustRightInd w:val="0"/>
-        <w:spacing w:before="75" w:after="75" w:line="360" w:lineRule="auto"/>
-        <w:rPr>
-          <w:rFonts w:ascii="Segoe UI" w:hAnsi="Segoe UI" w:cs="Segoe UI"/>
-          <w:sz w:val="20"/>
-          <w:szCs w:val="20"/>
-          <w:lang w:val="x-none"/>
-        </w:rPr>
-      </w:pPr>
-    </w:p>
-    <w:p>
-      <w:pPr>
-        <w:autoSpaceDE w:val="0"/>
-        <w:autoSpaceDN w:val="0"/>
-        <w:adjustRightInd w:val="0"/>
-        <w:spacing w:before="75" w:after="75" w:line="360" w:lineRule="auto"/>
-        <w:rPr>
-          <w:rFonts w:ascii="Segoe UI" w:hAnsi="Segoe UI" w:cs="Segoe UI"/>
-          <w:sz w:val="20"/>
-          <w:szCs w:val="20"/>
-          <w:lang w:val="x-none"/>
-        </w:rPr>
-      </w:pPr>
-    </w:p>
-    <w:p>
-      <w:pPr>
-        <w:autoSpaceDE w:val="0"/>
-        <w:autoSpaceDN w:val="0"/>
-        <w:adjustRightInd w:val="0"/>
-        <w:spacing w:before="75" w:after="75" w:line="360" w:lineRule="auto"/>
-        <w:rPr>
-          <w:rFonts w:ascii="Segoe UI" w:hAnsi="Segoe UI" w:cs="Segoe UI"/>
-          <w:sz w:val="20"/>
-          <w:szCs w:val="20"/>
-          <w:lang w:val="x-none"/>
-        </w:rPr>
-      </w:pPr>
-    </w:p>
-    <w:p>
-      <w:pPr>
         <w:pStyle w:val="Heading2"/>
       </w:pPr>
-      <w:bookmarkStart w:id="2" w:name="_Toc214945296"/>
+      <w:bookmarkStart w:id="4" w:name="_Toc227051243"/>
       <w:r>
         <w:lastRenderedPageBreak/>
         <w:t>Document Status - Open</w:t>
       </w:r>
-      <w:bookmarkEnd w:id="2"/>
+      <w:bookmarkEnd w:id="4"/>
     </w:p>
     <w:p>
       <w:pPr>
@@ -1095,7 +1315,7 @@
                     </pic:cNvPicPr>
                   </pic:nvPicPr>
                   <pic:blipFill>
-                    <a:blip r:embed="rId9">
+                    <a:blip r:embed="rId10">
                       <a:extLst>
                         <a:ext uri="{28A0092B-C50C-407E-A947-70E740481C1C}">
                           <a14:useLocalDpi xmlns:a14="http://schemas.microsoft.com/office/drawing/2010/main" val="0"/>
@@ -1391,12 +1611,12 @@
       <w:pPr>
         <w:pStyle w:val="Heading2"/>
       </w:pPr>
-      <w:bookmarkStart w:id="3" w:name="_Toc214945297"/>
+      <w:bookmarkStart w:id="5" w:name="_Toc227051244"/>
       <w:r>
         <w:lastRenderedPageBreak/>
         <w:t>Confirm Quotes and Orders - (Input menu)</w:t>
       </w:r>
-      <w:bookmarkEnd w:id="3"/>
+      <w:bookmarkEnd w:id="5"/>
     </w:p>
     <w:p>
       <w:pPr>
@@ -1483,7 +1703,7 @@
                     </pic:cNvPicPr>
                   </pic:nvPicPr>
                   <pic:blipFill>
-                    <a:blip r:embed="rId10">
+                    <a:blip r:embed="rId11">
                       <a:extLst>
                         <a:ext uri="{28A0092B-C50C-407E-A947-70E740481C1C}">
                           <a14:useLocalDpi xmlns:a14="http://schemas.microsoft.com/office/drawing/2010/main" val="0"/>
@@ -1577,7 +1797,7 @@
                     </pic:cNvPicPr>
                   </pic:nvPicPr>
                   <pic:blipFill>
-                    <a:blip r:embed="rId11">
+                    <a:blip r:embed="rId12">
                       <a:extLst>
                         <a:ext uri="{28A0092B-C50C-407E-A947-70E740481C1C}">
                           <a14:useLocalDpi xmlns:a14="http://schemas.microsoft.com/office/drawing/2010/main" val="0"/>

</xml_diff>